<commit_message>
Update Anexos 3 y 4
</commit_message>
<xml_diff>
--- a/public/assets/raw_documents/ANEXO 03 Lista de Participantes.docx
+++ b/public/assets/raw_documents/ANEXO 03 Lista de Participantes.docx
@@ -1,6 +1,6 @@
 
 <file path=word/document.xml><?xml version="1.0" encoding="utf-8"?>
-<w:document xmlns:wpc="http://schemas.microsoft.com/office/word/2010/wordprocessingCanvas" xmlns:cx="http://schemas.microsoft.com/office/drawing/2014/chartex" xmlns:cx1="http://schemas.microsoft.com/office/drawing/2015/9/8/chartex" xmlns:cx2="http://schemas.microsoft.com/office/drawing/2015/10/21/chartex" xmlns:cx3="http://schemas.microsoft.com/office/drawing/2016/5/9/chartex" xmlns:cx4="http://schemas.microsoft.com/office/drawing/2016/5/10/chartex" xmlns:cx5="http://schemas.microsoft.com/office/drawing/2016/5/11/chartex" xmlns:cx6="http://schemas.microsoft.com/office/drawing/2016/5/12/chartex" xmlns:cx7="http://schemas.microsoft.com/office/drawing/2016/5/13/chartex" xmlns:cx8="http://schemas.microsoft.com/office/drawing/2016/5/14/chartex" xmlns:mc="http://schemas.openxmlformats.org/markup-compatibility/2006" xmlns:aink="http://schemas.microsoft.com/office/drawing/2016/ink" xmlns:am3d="http://schemas.microsoft.com/office/drawing/2017/model3d" xmlns:o="urn:schemas-microsoft-com:office:office" xmlns:oel="http://schemas.microsoft.com/office/2019/extlst" xmlns:r="http://schemas.openxmlformats.org/officeDocument/2006/relationships" xmlns:m="http://schemas.openxmlformats.org/officeDocument/2006/math" xmlns:v="urn:schemas-microsoft-com:vml" xmlns:wp14="http://schemas.microsoft.com/office/word/2010/wordprocessingDrawing" xmlns:wp="http://schemas.openxmlformats.org/drawingml/2006/wordprocessingDrawing" xmlns:w10="urn:schemas-microsoft-com:office:word" xmlns:w="http://schemas.openxmlformats.org/wordprocessingml/2006/main" xmlns:w14="http://schemas.microsoft.com/office/word/2010/wordml" xmlns:w15="http://schemas.microsoft.com/office/word/2012/wordml" xmlns:w16cex="http://schemas.microsoft.com/office/word/2018/wordml/cex" xmlns:w16cid="http://schemas.microsoft.com/office/word/2016/wordml/cid" xmlns:w16="http://schemas.microsoft.com/office/word/2018/wordml" xmlns:w16sdtdh="http://schemas.microsoft.com/office/word/2020/wordml/sdtdatahash" xmlns:w16se="http://schemas.microsoft.com/office/word/2015/wordml/symex" xmlns:wpg="http://schemas.microsoft.com/office/word/2010/wordprocessingGroup" xmlns:wpi="http://schemas.microsoft.com/office/word/2010/wordprocessingInk" xmlns:wne="http://schemas.microsoft.com/office/word/2006/wordml" xmlns:wps="http://schemas.microsoft.com/office/word/2010/wordprocessingShape" mc:Ignorable="w14 w15 w16se w16cid w16 w16cex w16sdtdh wp14">
+<w:document xmlns:wpc="http://schemas.microsoft.com/office/word/2010/wordprocessingCanvas" xmlns:cx="http://schemas.microsoft.com/office/drawing/2014/chartex" xmlns:cx1="http://schemas.microsoft.com/office/drawing/2015/9/8/chartex" xmlns:cx2="http://schemas.microsoft.com/office/drawing/2015/10/21/chartex" xmlns:cx3="http://schemas.microsoft.com/office/drawing/2016/5/9/chartex" xmlns:cx4="http://schemas.microsoft.com/office/drawing/2016/5/10/chartex" xmlns:cx5="http://schemas.microsoft.com/office/drawing/2016/5/11/chartex" xmlns:cx6="http://schemas.microsoft.com/office/drawing/2016/5/12/chartex" xmlns:cx7="http://schemas.microsoft.com/office/drawing/2016/5/13/chartex" xmlns:cx8="http://schemas.microsoft.com/office/drawing/2016/5/14/chartex" xmlns:mc="http://schemas.openxmlformats.org/markup-compatibility/2006" xmlns:aink="http://schemas.microsoft.com/office/drawing/2016/ink" xmlns:am3d="http://schemas.microsoft.com/office/drawing/2017/model3d" xmlns:o="urn:schemas-microsoft-com:office:office" xmlns:oel="http://schemas.microsoft.com/office/2019/extlst" xmlns:r="http://schemas.openxmlformats.org/officeDocument/2006/relationships" xmlns:m="http://schemas.openxmlformats.org/officeDocument/2006/math" xmlns:v="urn:schemas-microsoft-com:vml" xmlns:wp14="http://schemas.microsoft.com/office/word/2010/wordprocessingDrawing" xmlns:wp="http://schemas.openxmlformats.org/drawingml/2006/wordprocessingDrawing" xmlns:w10="urn:schemas-microsoft-com:office:word" xmlns:w="http://schemas.openxmlformats.org/wordprocessingml/2006/main" xmlns:w14="http://schemas.microsoft.com/office/word/2010/wordml" xmlns:w15="http://schemas.microsoft.com/office/word/2012/wordml" xmlns:w16cex="http://schemas.microsoft.com/office/word/2018/wordml/cex" xmlns:w16cid="http://schemas.microsoft.com/office/word/2016/wordml/cid" xmlns:w16="http://schemas.microsoft.com/office/word/2018/wordml" xmlns:w16du="http://schemas.microsoft.com/office/word/2023/wordml/word16du" xmlns:w16sdtdh="http://schemas.microsoft.com/office/word/2020/wordml/sdtdatahash" xmlns:w16se="http://schemas.microsoft.com/office/word/2015/wordml/symex" xmlns:wpg="http://schemas.microsoft.com/office/word/2010/wordprocessingGroup" xmlns:wpi="http://schemas.microsoft.com/office/word/2010/wordprocessingInk" xmlns:wne="http://schemas.microsoft.com/office/word/2006/wordml" xmlns:wps="http://schemas.microsoft.com/office/word/2010/wordprocessingShape" mc:Ignorable="w14 w15 w16se w16cid w16 w16cex w16sdtdh w16du wp14">
   <w:background w:color="FFFFFF"/>
   <w:body>
     <w:p>
@@ -13,6 +13,68 @@
           <w:sz w:val="32"/>
         </w:rPr>
       </w:pPr>
+      <w:r>
+        <w:rPr>
+          <w:rFonts w:ascii="Arial" w:hAnsi="Arial" w:cs="Arial"/>
+          <w:b/>
+          <w:sz w:val="32"/>
+        </w:rPr>
+        <w:drawing>
+          <wp:anchor distT="0" distB="0" distL="114300" distR="114300" simplePos="0" relativeHeight="251658240" behindDoc="0" locked="0" layoutInCell="1" allowOverlap="1" wp14:anchorId="27F2A0F1" wp14:editId="6A6F0ADE">
+            <wp:simplePos x="0" y="0"/>
+            <wp:positionH relativeFrom="column">
+              <wp:posOffset>7311300</wp:posOffset>
+            </wp:positionH>
+            <wp:positionV relativeFrom="paragraph">
+              <wp:posOffset>-321401</wp:posOffset>
+            </wp:positionV>
+            <wp:extent cx="1933774" cy="1491342"/>
+            <wp:effectExtent l="0" t="0" r="0" b="0"/>
+            <wp:wrapNone/>
+            <wp:docPr id="584822773" name="Imagen 1"/>
+            <wp:cNvGraphicFramePr>
+              <a:graphicFrameLocks xmlns:a="http://schemas.openxmlformats.org/drawingml/2006/main" noChangeAspect="1"/>
+            </wp:cNvGraphicFramePr>
+            <a:graphic xmlns:a="http://schemas.openxmlformats.org/drawingml/2006/main">
+              <a:graphicData uri="http://schemas.openxmlformats.org/drawingml/2006/picture">
+                <pic:pic xmlns:pic="http://schemas.openxmlformats.org/drawingml/2006/picture">
+                  <pic:nvPicPr>
+                    <pic:cNvPr id="584822773" name=""/>
+                    <pic:cNvPicPr/>
+                  </pic:nvPicPr>
+                  <pic:blipFill>
+                    <a:blip r:embed="rId10" cstate="print">
+                      <a:extLst>
+                        <a:ext uri="{28A0092B-C50C-407E-A947-70E740481C1C}">
+                          <a14:useLocalDpi xmlns:a14="http://schemas.microsoft.com/office/drawing/2010/main" val="0"/>
+                        </a:ext>
+                      </a:extLst>
+                    </a:blip>
+                    <a:stretch>
+                      <a:fillRect/>
+                    </a:stretch>
+                  </pic:blipFill>
+                  <pic:spPr>
+                    <a:xfrm>
+                      <a:off x="0" y="0"/>
+                      <a:ext cx="1933774" cy="1491342"/>
+                    </a:xfrm>
+                    <a:prstGeom prst="rect">
+                      <a:avLst/>
+                    </a:prstGeom>
+                  </pic:spPr>
+                </pic:pic>
+              </a:graphicData>
+            </a:graphic>
+            <wp14:sizeRelH relativeFrom="page">
+              <wp14:pctWidth>0</wp14:pctWidth>
+            </wp14:sizeRelH>
+            <wp14:sizeRelV relativeFrom="page">
+              <wp14:pctHeight>0</wp14:pctHeight>
+            </wp14:sizeRelV>
+          </wp:anchor>
+        </w:drawing>
+      </w:r>
       <w:r>
         <w:rPr>
           <w:rFonts w:ascii="Arial" w:hAnsi="Arial" w:cs="Arial"/>
@@ -139,6 +201,14 @@
                 <w:szCs w:val="20"/>
               </w:rPr>
             </w:pPr>
+            <w:r>
+              <w:rPr>
+                <w:rFonts w:ascii="Arial" w:hAnsi="Arial" w:cs="Arial"/>
+                <w:sz w:val="20"/>
+                <w:szCs w:val="20"/>
+              </w:rPr>
+              <w:t>JOTI DE MANADA – MITOS Y LEYENDAS QUE NOS UNEN</w:t>
+            </w:r>
           </w:p>
         </w:tc>
         <w:tc>
@@ -243,12 +313,21 @@
                 <w:between w:val="nil"/>
               </w:pBdr>
               <w:spacing w:line="240" w:lineRule="auto"/>
-              <w:rPr>
-                <w:rFonts w:ascii="Arial" w:hAnsi="Arial" w:cs="Arial"/>
-                <w:sz w:val="20"/>
-                <w:szCs w:val="20"/>
-              </w:rPr>
-            </w:pPr>
+              <w:jc w:val="center"/>
+              <w:rPr>
+                <w:rFonts w:ascii="Arial" w:hAnsi="Arial" w:cs="Arial"/>
+                <w:sz w:val="20"/>
+                <w:szCs w:val="20"/>
+              </w:rPr>
+            </w:pPr>
+            <w:r>
+              <w:rPr>
+                <w:rFonts w:ascii="Arial" w:hAnsi="Arial" w:cs="Arial"/>
+                <w:sz w:val="20"/>
+                <w:szCs w:val="20"/>
+              </w:rPr>
+              <w:t>17 DE OCTUBRE</w:t>
+            </w:r>
           </w:p>
         </w:tc>
       </w:tr>
@@ -325,6 +404,14 @@
                 <w:szCs w:val="20"/>
               </w:rPr>
             </w:pPr>
+            <w:r>
+              <w:rPr>
+                <w:rFonts w:ascii="Arial" w:hAnsi="Arial" w:cs="Arial"/>
+                <w:sz w:val="20"/>
+                <w:szCs w:val="20"/>
+              </w:rPr>
+              <w:t>LOBATO</w:t>
+            </w:r>
           </w:p>
         </w:tc>
         <w:tc>
@@ -6494,8 +6581,8 @@
       </w:r>
     </w:p>
     <w:sectPr>
-      <w:headerReference w:type="default" r:id="rId10"/>
-      <w:footerReference w:type="default" r:id="rId11"/>
+      <w:headerReference w:type="default" r:id="rId11"/>
+      <w:footerReference w:type="default" r:id="rId12"/>
       <w:pgSz w:w="16838" w:h="11906" w:orient="landscape"/>
       <w:pgMar w:top="1133" w:right="914" w:bottom="1133" w:left="907" w:header="510" w:footer="720" w:gutter="0"/>
       <w:pgNumType w:start="1"/>
@@ -6507,7 +6594,7 @@
 </file>
 
 <file path=word/endnotes.xml><?xml version="1.0" encoding="utf-8"?>
-<w:endnotes xmlns:wpc="http://schemas.microsoft.com/office/word/2010/wordprocessingCanvas" xmlns:cx="http://schemas.microsoft.com/office/drawing/2014/chartex" xmlns:cx1="http://schemas.microsoft.com/office/drawing/2015/9/8/chartex" xmlns:cx2="http://schemas.microsoft.com/office/drawing/2015/10/21/chartex" xmlns:cx3="http://schemas.microsoft.com/office/drawing/2016/5/9/chartex" xmlns:cx4="http://schemas.microsoft.com/office/drawing/2016/5/10/chartex" xmlns:cx5="http://schemas.microsoft.com/office/drawing/2016/5/11/chartex" xmlns:cx6="http://schemas.microsoft.com/office/drawing/2016/5/12/chartex" xmlns:cx7="http://schemas.microsoft.com/office/drawing/2016/5/13/chartex" xmlns:cx8="http://schemas.microsoft.com/office/drawing/2016/5/14/chartex" xmlns:mc="http://schemas.openxmlformats.org/markup-compatibility/2006" xmlns:aink="http://schemas.microsoft.com/office/drawing/2016/ink" xmlns:am3d="http://schemas.microsoft.com/office/drawing/2017/model3d" xmlns:o="urn:schemas-microsoft-com:office:office" xmlns:oel="http://schemas.microsoft.com/office/2019/extlst" xmlns:r="http://schemas.openxmlformats.org/officeDocument/2006/relationships" xmlns:m="http://schemas.openxmlformats.org/officeDocument/2006/math" xmlns:v="urn:schemas-microsoft-com:vml" xmlns:wp14="http://schemas.microsoft.com/office/word/2010/wordprocessingDrawing" xmlns:wp="http://schemas.openxmlformats.org/drawingml/2006/wordprocessingDrawing" xmlns:w10="urn:schemas-microsoft-com:office:word" xmlns:w="http://schemas.openxmlformats.org/wordprocessingml/2006/main" xmlns:w14="http://schemas.microsoft.com/office/word/2010/wordml" xmlns:w15="http://schemas.microsoft.com/office/word/2012/wordml" xmlns:w16cex="http://schemas.microsoft.com/office/word/2018/wordml/cex" xmlns:w16cid="http://schemas.microsoft.com/office/word/2016/wordml/cid" xmlns:w16="http://schemas.microsoft.com/office/word/2018/wordml" xmlns:w16sdtdh="http://schemas.microsoft.com/office/word/2020/wordml/sdtdatahash" xmlns:w16se="http://schemas.microsoft.com/office/word/2015/wordml/symex" xmlns:wpg="http://schemas.microsoft.com/office/word/2010/wordprocessingGroup" xmlns:wpi="http://schemas.microsoft.com/office/word/2010/wordprocessingInk" xmlns:wne="http://schemas.microsoft.com/office/word/2006/wordml" xmlns:wps="http://schemas.microsoft.com/office/word/2010/wordprocessingShape" mc:Ignorable="w14 w15 w16se w16cid w16 w16cex w16sdtdh wp14">
+<w:endnotes xmlns:wpc="http://schemas.microsoft.com/office/word/2010/wordprocessingCanvas" xmlns:cx="http://schemas.microsoft.com/office/drawing/2014/chartex" xmlns:cx1="http://schemas.microsoft.com/office/drawing/2015/9/8/chartex" xmlns:cx2="http://schemas.microsoft.com/office/drawing/2015/10/21/chartex" xmlns:cx3="http://schemas.microsoft.com/office/drawing/2016/5/9/chartex" xmlns:cx4="http://schemas.microsoft.com/office/drawing/2016/5/10/chartex" xmlns:cx5="http://schemas.microsoft.com/office/drawing/2016/5/11/chartex" xmlns:cx6="http://schemas.microsoft.com/office/drawing/2016/5/12/chartex" xmlns:cx7="http://schemas.microsoft.com/office/drawing/2016/5/13/chartex" xmlns:cx8="http://schemas.microsoft.com/office/drawing/2016/5/14/chartex" xmlns:mc="http://schemas.openxmlformats.org/markup-compatibility/2006" xmlns:aink="http://schemas.microsoft.com/office/drawing/2016/ink" xmlns:am3d="http://schemas.microsoft.com/office/drawing/2017/model3d" xmlns:o="urn:schemas-microsoft-com:office:office" xmlns:oel="http://schemas.microsoft.com/office/2019/extlst" xmlns:r="http://schemas.openxmlformats.org/officeDocument/2006/relationships" xmlns:m="http://schemas.openxmlformats.org/officeDocument/2006/math" xmlns:v="urn:schemas-microsoft-com:vml" xmlns:wp14="http://schemas.microsoft.com/office/word/2010/wordprocessingDrawing" xmlns:wp="http://schemas.openxmlformats.org/drawingml/2006/wordprocessingDrawing" xmlns:w10="urn:schemas-microsoft-com:office:word" xmlns:w="http://schemas.openxmlformats.org/wordprocessingml/2006/main" xmlns:w14="http://schemas.microsoft.com/office/word/2010/wordml" xmlns:w15="http://schemas.microsoft.com/office/word/2012/wordml" xmlns:w16cex="http://schemas.microsoft.com/office/word/2018/wordml/cex" xmlns:w16cid="http://schemas.microsoft.com/office/word/2016/wordml/cid" xmlns:w16="http://schemas.microsoft.com/office/word/2018/wordml" xmlns:w16du="http://schemas.microsoft.com/office/word/2023/wordml/word16du" xmlns:w16sdtdh="http://schemas.microsoft.com/office/word/2020/wordml/sdtdatahash" xmlns:w16se="http://schemas.microsoft.com/office/word/2015/wordml/symex" xmlns:wpg="http://schemas.microsoft.com/office/word/2010/wordprocessingGroup" xmlns:wpi="http://schemas.microsoft.com/office/word/2010/wordprocessingInk" xmlns:wne="http://schemas.microsoft.com/office/word/2006/wordml" xmlns:wps="http://schemas.microsoft.com/office/word/2010/wordprocessingShape" mc:Ignorable="w14 w15 w16se w16cid w16 w16cex w16sdtdh w16du wp14">
   <w:endnote w:type="separator" w:id="-1">
     <w:p>
       <w:pPr>
@@ -6532,7 +6619,7 @@
 </file>
 
 <file path=word/footer1.xml><?xml version="1.0" encoding="utf-8"?>
-<w:ftr xmlns:wpc="http://schemas.microsoft.com/office/word/2010/wordprocessingCanvas" xmlns:cx="http://schemas.microsoft.com/office/drawing/2014/chartex" xmlns:cx1="http://schemas.microsoft.com/office/drawing/2015/9/8/chartex" xmlns:cx2="http://schemas.microsoft.com/office/drawing/2015/10/21/chartex" xmlns:cx3="http://schemas.microsoft.com/office/drawing/2016/5/9/chartex" xmlns:cx4="http://schemas.microsoft.com/office/drawing/2016/5/10/chartex" xmlns:cx5="http://schemas.microsoft.com/office/drawing/2016/5/11/chartex" xmlns:cx6="http://schemas.microsoft.com/office/drawing/2016/5/12/chartex" xmlns:cx7="http://schemas.microsoft.com/office/drawing/2016/5/13/chartex" xmlns:cx8="http://schemas.microsoft.com/office/drawing/2016/5/14/chartex" xmlns:mc="http://schemas.openxmlformats.org/markup-compatibility/2006" xmlns:aink="http://schemas.microsoft.com/office/drawing/2016/ink" xmlns:am3d="http://schemas.microsoft.com/office/drawing/2017/model3d" xmlns:o="urn:schemas-microsoft-com:office:office" xmlns:oel="http://schemas.microsoft.com/office/2019/extlst" xmlns:r="http://schemas.openxmlformats.org/officeDocument/2006/relationships" xmlns:m="http://schemas.openxmlformats.org/officeDocument/2006/math" xmlns:v="urn:schemas-microsoft-com:vml" xmlns:wp14="http://schemas.microsoft.com/office/word/2010/wordprocessingDrawing" xmlns:wp="http://schemas.openxmlformats.org/drawingml/2006/wordprocessingDrawing" xmlns:w10="urn:schemas-microsoft-com:office:word" xmlns:w="http://schemas.openxmlformats.org/wordprocessingml/2006/main" xmlns:w14="http://schemas.microsoft.com/office/word/2010/wordml" xmlns:w15="http://schemas.microsoft.com/office/word/2012/wordml" xmlns:w16cex="http://schemas.microsoft.com/office/word/2018/wordml/cex" xmlns:w16cid="http://schemas.microsoft.com/office/word/2016/wordml/cid" xmlns:w16="http://schemas.microsoft.com/office/word/2018/wordml" xmlns:w16sdtdh="http://schemas.microsoft.com/office/word/2020/wordml/sdtdatahash" xmlns:w16se="http://schemas.microsoft.com/office/word/2015/wordml/symex" xmlns:wpg="http://schemas.microsoft.com/office/word/2010/wordprocessingGroup" xmlns:wpi="http://schemas.microsoft.com/office/word/2010/wordprocessingInk" xmlns:wne="http://schemas.microsoft.com/office/word/2006/wordml" xmlns:wps="http://schemas.microsoft.com/office/word/2010/wordprocessingShape" mc:Ignorable="w14 w15 w16se w16cid w16 w16cex w16sdtdh wp14">
+<w:ftr xmlns:wpc="http://schemas.microsoft.com/office/word/2010/wordprocessingCanvas" xmlns:cx="http://schemas.microsoft.com/office/drawing/2014/chartex" xmlns:cx1="http://schemas.microsoft.com/office/drawing/2015/9/8/chartex" xmlns:cx2="http://schemas.microsoft.com/office/drawing/2015/10/21/chartex" xmlns:cx3="http://schemas.microsoft.com/office/drawing/2016/5/9/chartex" xmlns:cx4="http://schemas.microsoft.com/office/drawing/2016/5/10/chartex" xmlns:cx5="http://schemas.microsoft.com/office/drawing/2016/5/11/chartex" xmlns:cx6="http://schemas.microsoft.com/office/drawing/2016/5/12/chartex" xmlns:cx7="http://schemas.microsoft.com/office/drawing/2016/5/13/chartex" xmlns:cx8="http://schemas.microsoft.com/office/drawing/2016/5/14/chartex" xmlns:mc="http://schemas.openxmlformats.org/markup-compatibility/2006" xmlns:aink="http://schemas.microsoft.com/office/drawing/2016/ink" xmlns:am3d="http://schemas.microsoft.com/office/drawing/2017/model3d" xmlns:o="urn:schemas-microsoft-com:office:office" xmlns:oel="http://schemas.microsoft.com/office/2019/extlst" xmlns:r="http://schemas.openxmlformats.org/officeDocument/2006/relationships" xmlns:m="http://schemas.openxmlformats.org/officeDocument/2006/math" xmlns:v="urn:schemas-microsoft-com:vml" xmlns:wp14="http://schemas.microsoft.com/office/word/2010/wordprocessingDrawing" xmlns:wp="http://schemas.openxmlformats.org/drawingml/2006/wordprocessingDrawing" xmlns:w10="urn:schemas-microsoft-com:office:word" xmlns:w="http://schemas.openxmlformats.org/wordprocessingml/2006/main" xmlns:w14="http://schemas.microsoft.com/office/word/2010/wordml" xmlns:w15="http://schemas.microsoft.com/office/word/2012/wordml" xmlns:w16cex="http://schemas.microsoft.com/office/word/2018/wordml/cex" xmlns:w16cid="http://schemas.microsoft.com/office/word/2016/wordml/cid" xmlns:w16="http://schemas.microsoft.com/office/word/2018/wordml" xmlns:w16du="http://schemas.microsoft.com/office/word/2023/wordml/word16du" xmlns:w16sdtdh="http://schemas.microsoft.com/office/word/2020/wordml/sdtdatahash" xmlns:w16se="http://schemas.microsoft.com/office/word/2015/wordml/symex" xmlns:wpg="http://schemas.microsoft.com/office/word/2010/wordprocessingGroup" xmlns:wpi="http://schemas.microsoft.com/office/word/2010/wordprocessingInk" xmlns:wne="http://schemas.microsoft.com/office/word/2006/wordml" xmlns:wps="http://schemas.microsoft.com/office/word/2010/wordprocessingShape" mc:Ignorable="w14 w15 w16se w16cid w16 w16cex w16sdtdh w16du wp14">
   <w:p>
     <w:pPr>
       <w:pStyle w:val="Piedepgina"/>
@@ -6583,7 +6670,7 @@
 </file>
 
 <file path=word/footnotes.xml><?xml version="1.0" encoding="utf-8"?>
-<w:footnotes xmlns:wpc="http://schemas.microsoft.com/office/word/2010/wordprocessingCanvas" xmlns:cx="http://schemas.microsoft.com/office/drawing/2014/chartex" xmlns:cx1="http://schemas.microsoft.com/office/drawing/2015/9/8/chartex" xmlns:cx2="http://schemas.microsoft.com/office/drawing/2015/10/21/chartex" xmlns:cx3="http://schemas.microsoft.com/office/drawing/2016/5/9/chartex" xmlns:cx4="http://schemas.microsoft.com/office/drawing/2016/5/10/chartex" xmlns:cx5="http://schemas.microsoft.com/office/drawing/2016/5/11/chartex" xmlns:cx6="http://schemas.microsoft.com/office/drawing/2016/5/12/chartex" xmlns:cx7="http://schemas.microsoft.com/office/drawing/2016/5/13/chartex" xmlns:cx8="http://schemas.microsoft.com/office/drawing/2016/5/14/chartex" xmlns:mc="http://schemas.openxmlformats.org/markup-compatibility/2006" xmlns:aink="http://schemas.microsoft.com/office/drawing/2016/ink" xmlns:am3d="http://schemas.microsoft.com/office/drawing/2017/model3d" xmlns:o="urn:schemas-microsoft-com:office:office" xmlns:oel="http://schemas.microsoft.com/office/2019/extlst" xmlns:r="http://schemas.openxmlformats.org/officeDocument/2006/relationships" xmlns:m="http://schemas.openxmlformats.org/officeDocument/2006/math" xmlns:v="urn:schemas-microsoft-com:vml" xmlns:wp14="http://schemas.microsoft.com/office/word/2010/wordprocessingDrawing" xmlns:wp="http://schemas.openxmlformats.org/drawingml/2006/wordprocessingDrawing" xmlns:w10="urn:schemas-microsoft-com:office:word" xmlns:w="http://schemas.openxmlformats.org/wordprocessingml/2006/main" xmlns:w14="http://schemas.microsoft.com/office/word/2010/wordml" xmlns:w15="http://schemas.microsoft.com/office/word/2012/wordml" xmlns:w16cex="http://schemas.microsoft.com/office/word/2018/wordml/cex" xmlns:w16cid="http://schemas.microsoft.com/office/word/2016/wordml/cid" xmlns:w16="http://schemas.microsoft.com/office/word/2018/wordml" xmlns:w16sdtdh="http://schemas.microsoft.com/office/word/2020/wordml/sdtdatahash" xmlns:w16se="http://schemas.microsoft.com/office/word/2015/wordml/symex" xmlns:wpg="http://schemas.microsoft.com/office/word/2010/wordprocessingGroup" xmlns:wpi="http://schemas.microsoft.com/office/word/2010/wordprocessingInk" xmlns:wne="http://schemas.microsoft.com/office/word/2006/wordml" xmlns:wps="http://schemas.microsoft.com/office/word/2010/wordprocessingShape" mc:Ignorable="w14 w15 w16se w16cid w16 w16cex w16sdtdh wp14">
+<w:footnotes xmlns:wpc="http://schemas.microsoft.com/office/word/2010/wordprocessingCanvas" xmlns:cx="http://schemas.microsoft.com/office/drawing/2014/chartex" xmlns:cx1="http://schemas.microsoft.com/office/drawing/2015/9/8/chartex" xmlns:cx2="http://schemas.microsoft.com/office/drawing/2015/10/21/chartex" xmlns:cx3="http://schemas.microsoft.com/office/drawing/2016/5/9/chartex" xmlns:cx4="http://schemas.microsoft.com/office/drawing/2016/5/10/chartex" xmlns:cx5="http://schemas.microsoft.com/office/drawing/2016/5/11/chartex" xmlns:cx6="http://schemas.microsoft.com/office/drawing/2016/5/12/chartex" xmlns:cx7="http://schemas.microsoft.com/office/drawing/2016/5/13/chartex" xmlns:cx8="http://schemas.microsoft.com/office/drawing/2016/5/14/chartex" xmlns:mc="http://schemas.openxmlformats.org/markup-compatibility/2006" xmlns:aink="http://schemas.microsoft.com/office/drawing/2016/ink" xmlns:am3d="http://schemas.microsoft.com/office/drawing/2017/model3d" xmlns:o="urn:schemas-microsoft-com:office:office" xmlns:oel="http://schemas.microsoft.com/office/2019/extlst" xmlns:r="http://schemas.openxmlformats.org/officeDocument/2006/relationships" xmlns:m="http://schemas.openxmlformats.org/officeDocument/2006/math" xmlns:v="urn:schemas-microsoft-com:vml" xmlns:wp14="http://schemas.microsoft.com/office/word/2010/wordprocessingDrawing" xmlns:wp="http://schemas.openxmlformats.org/drawingml/2006/wordprocessingDrawing" xmlns:w10="urn:schemas-microsoft-com:office:word" xmlns:w="http://schemas.openxmlformats.org/wordprocessingml/2006/main" xmlns:w14="http://schemas.microsoft.com/office/word/2010/wordml" xmlns:w15="http://schemas.microsoft.com/office/word/2012/wordml" xmlns:w16cex="http://schemas.microsoft.com/office/word/2018/wordml/cex" xmlns:w16cid="http://schemas.microsoft.com/office/word/2016/wordml/cid" xmlns:w16="http://schemas.microsoft.com/office/word/2018/wordml" xmlns:w16du="http://schemas.microsoft.com/office/word/2023/wordml/word16du" xmlns:w16sdtdh="http://schemas.microsoft.com/office/word/2020/wordml/sdtdatahash" xmlns:w16se="http://schemas.microsoft.com/office/word/2015/wordml/symex" xmlns:wpg="http://schemas.microsoft.com/office/word/2010/wordprocessingGroup" xmlns:wpi="http://schemas.microsoft.com/office/word/2010/wordprocessingInk" xmlns:wne="http://schemas.microsoft.com/office/word/2006/wordml" xmlns:wps="http://schemas.microsoft.com/office/word/2010/wordprocessingShape" mc:Ignorable="w14 w15 w16se w16cid w16 w16cex w16sdtdh w16du wp14">
   <w:footnote w:type="separator" w:id="-1">
     <w:p>
       <w:pPr>
@@ -6608,7 +6695,7 @@
 </file>
 
 <file path=word/header1.xml><?xml version="1.0" encoding="utf-8"?>
-<w:hdr xmlns:wpc="http://schemas.microsoft.com/office/word/2010/wordprocessingCanvas" xmlns:cx="http://schemas.microsoft.com/office/drawing/2014/chartex" xmlns:cx1="http://schemas.microsoft.com/office/drawing/2015/9/8/chartex" xmlns:cx2="http://schemas.microsoft.com/office/drawing/2015/10/21/chartex" xmlns:cx3="http://schemas.microsoft.com/office/drawing/2016/5/9/chartex" xmlns:cx4="http://schemas.microsoft.com/office/drawing/2016/5/10/chartex" xmlns:cx5="http://schemas.microsoft.com/office/drawing/2016/5/11/chartex" xmlns:cx6="http://schemas.microsoft.com/office/drawing/2016/5/12/chartex" xmlns:cx7="http://schemas.microsoft.com/office/drawing/2016/5/13/chartex" xmlns:cx8="http://schemas.microsoft.com/office/drawing/2016/5/14/chartex" xmlns:mc="http://schemas.openxmlformats.org/markup-compatibility/2006" xmlns:aink="http://schemas.microsoft.com/office/drawing/2016/ink" xmlns:am3d="http://schemas.microsoft.com/office/drawing/2017/model3d" xmlns:o="urn:schemas-microsoft-com:office:office" xmlns:oel="http://schemas.microsoft.com/office/2019/extlst" xmlns:r="http://schemas.openxmlformats.org/officeDocument/2006/relationships" xmlns:m="http://schemas.openxmlformats.org/officeDocument/2006/math" xmlns:v="urn:schemas-microsoft-com:vml" xmlns:wp14="http://schemas.microsoft.com/office/word/2010/wordprocessingDrawing" xmlns:wp="http://schemas.openxmlformats.org/drawingml/2006/wordprocessingDrawing" xmlns:w10="urn:schemas-microsoft-com:office:word" xmlns:w="http://schemas.openxmlformats.org/wordprocessingml/2006/main" xmlns:w14="http://schemas.microsoft.com/office/word/2010/wordml" xmlns:w15="http://schemas.microsoft.com/office/word/2012/wordml" xmlns:w16cex="http://schemas.microsoft.com/office/word/2018/wordml/cex" xmlns:w16cid="http://schemas.microsoft.com/office/word/2016/wordml/cid" xmlns:w16="http://schemas.microsoft.com/office/word/2018/wordml" xmlns:w16sdtdh="http://schemas.microsoft.com/office/word/2020/wordml/sdtdatahash" xmlns:w16se="http://schemas.microsoft.com/office/word/2015/wordml/symex" xmlns:wpg="http://schemas.microsoft.com/office/word/2010/wordprocessingGroup" xmlns:wpi="http://schemas.microsoft.com/office/word/2010/wordprocessingInk" xmlns:wne="http://schemas.microsoft.com/office/word/2006/wordml" xmlns:wps="http://schemas.microsoft.com/office/word/2010/wordprocessingShape" mc:Ignorable="w14 w15 w16se w16cid w16 w16cex w16sdtdh wp14">
+<w:hdr xmlns:wpc="http://schemas.microsoft.com/office/word/2010/wordprocessingCanvas" xmlns:cx="http://schemas.microsoft.com/office/drawing/2014/chartex" xmlns:cx1="http://schemas.microsoft.com/office/drawing/2015/9/8/chartex" xmlns:cx2="http://schemas.microsoft.com/office/drawing/2015/10/21/chartex" xmlns:cx3="http://schemas.microsoft.com/office/drawing/2016/5/9/chartex" xmlns:cx4="http://schemas.microsoft.com/office/drawing/2016/5/10/chartex" xmlns:cx5="http://schemas.microsoft.com/office/drawing/2016/5/11/chartex" xmlns:cx6="http://schemas.microsoft.com/office/drawing/2016/5/12/chartex" xmlns:cx7="http://schemas.microsoft.com/office/drawing/2016/5/13/chartex" xmlns:cx8="http://schemas.microsoft.com/office/drawing/2016/5/14/chartex" xmlns:mc="http://schemas.openxmlformats.org/markup-compatibility/2006" xmlns:aink="http://schemas.microsoft.com/office/drawing/2016/ink" xmlns:am3d="http://schemas.microsoft.com/office/drawing/2017/model3d" xmlns:o="urn:schemas-microsoft-com:office:office" xmlns:oel="http://schemas.microsoft.com/office/2019/extlst" xmlns:r="http://schemas.openxmlformats.org/officeDocument/2006/relationships" xmlns:m="http://schemas.openxmlformats.org/officeDocument/2006/math" xmlns:v="urn:schemas-microsoft-com:vml" xmlns:wp14="http://schemas.microsoft.com/office/word/2010/wordprocessingDrawing" xmlns:wp="http://schemas.openxmlformats.org/drawingml/2006/wordprocessingDrawing" xmlns:w10="urn:schemas-microsoft-com:office:word" xmlns:w="http://schemas.openxmlformats.org/wordprocessingml/2006/main" xmlns:w14="http://schemas.microsoft.com/office/word/2010/wordml" xmlns:w15="http://schemas.microsoft.com/office/word/2012/wordml" xmlns:w16cex="http://schemas.microsoft.com/office/word/2018/wordml/cex" xmlns:w16cid="http://schemas.microsoft.com/office/word/2016/wordml/cid" xmlns:w16="http://schemas.microsoft.com/office/word/2018/wordml" xmlns:w16du="http://schemas.microsoft.com/office/word/2023/wordml/word16du" xmlns:w16sdtdh="http://schemas.microsoft.com/office/word/2020/wordml/sdtdatahash" xmlns:w16se="http://schemas.microsoft.com/office/word/2015/wordml/symex" xmlns:wpg="http://schemas.microsoft.com/office/word/2010/wordprocessingGroup" xmlns:wpi="http://schemas.microsoft.com/office/word/2010/wordprocessingInk" xmlns:wne="http://schemas.microsoft.com/office/word/2006/wordml" xmlns:wps="http://schemas.microsoft.com/office/word/2010/wordprocessingShape" mc:Ignorable="w14 w15 w16se w16cid w16 w16cex w16sdtdh w16du wp14">
   <w:p>
     <w:pPr>
       <w:jc w:val="both"/>
@@ -6653,7 +6740,7 @@
 </file>
 
 <file path=word/numbering.xml><?xml version="1.0" encoding="utf-8"?>
-<w:numbering xmlns:wpc="http://schemas.microsoft.com/office/word/2010/wordprocessingCanvas" xmlns:cx="http://schemas.microsoft.com/office/drawing/2014/chartex" xmlns:cx1="http://schemas.microsoft.com/office/drawing/2015/9/8/chartex" xmlns:cx2="http://schemas.microsoft.com/office/drawing/2015/10/21/chartex" xmlns:cx3="http://schemas.microsoft.com/office/drawing/2016/5/9/chartex" xmlns:cx4="http://schemas.microsoft.com/office/drawing/2016/5/10/chartex" xmlns:cx5="http://schemas.microsoft.com/office/drawing/2016/5/11/chartex" xmlns:cx6="http://schemas.microsoft.com/office/drawing/2016/5/12/chartex" xmlns:cx7="http://schemas.microsoft.com/office/drawing/2016/5/13/chartex" xmlns:cx8="http://schemas.microsoft.com/office/drawing/2016/5/14/chartex" xmlns:mc="http://schemas.openxmlformats.org/markup-compatibility/2006" xmlns:aink="http://schemas.microsoft.com/office/drawing/2016/ink" xmlns:am3d="http://schemas.microsoft.com/office/drawing/2017/model3d" xmlns:o="urn:schemas-microsoft-com:office:office" xmlns:oel="http://schemas.microsoft.com/office/2019/extlst" xmlns:r="http://schemas.openxmlformats.org/officeDocument/2006/relationships" xmlns:m="http://schemas.openxmlformats.org/officeDocument/2006/math" xmlns:v="urn:schemas-microsoft-com:vml" xmlns:wp14="http://schemas.microsoft.com/office/word/2010/wordprocessingDrawing" xmlns:wp="http://schemas.openxmlformats.org/drawingml/2006/wordprocessingDrawing" xmlns:w10="urn:schemas-microsoft-com:office:word" xmlns:w="http://schemas.openxmlformats.org/wordprocessingml/2006/main" xmlns:w14="http://schemas.microsoft.com/office/word/2010/wordml" xmlns:w15="http://schemas.microsoft.com/office/word/2012/wordml" xmlns:w16cex="http://schemas.microsoft.com/office/word/2018/wordml/cex" xmlns:w16cid="http://schemas.microsoft.com/office/word/2016/wordml/cid" xmlns:w16="http://schemas.microsoft.com/office/word/2018/wordml" xmlns:w16sdtdh="http://schemas.microsoft.com/office/word/2020/wordml/sdtdatahash" xmlns:w16se="http://schemas.microsoft.com/office/word/2015/wordml/symex" xmlns:wpg="http://schemas.microsoft.com/office/word/2010/wordprocessingGroup" xmlns:wpi="http://schemas.microsoft.com/office/word/2010/wordprocessingInk" xmlns:wne="http://schemas.microsoft.com/office/word/2006/wordml" xmlns:wps="http://schemas.microsoft.com/office/word/2010/wordprocessingShape" mc:Ignorable="w14 w15 w16se w16cid w16 w16cex w16sdtdh wp14">
+<w:numbering xmlns:wpc="http://schemas.microsoft.com/office/word/2010/wordprocessingCanvas" xmlns:cx="http://schemas.microsoft.com/office/drawing/2014/chartex" xmlns:cx1="http://schemas.microsoft.com/office/drawing/2015/9/8/chartex" xmlns:cx2="http://schemas.microsoft.com/office/drawing/2015/10/21/chartex" xmlns:cx3="http://schemas.microsoft.com/office/drawing/2016/5/9/chartex" xmlns:cx4="http://schemas.microsoft.com/office/drawing/2016/5/10/chartex" xmlns:cx5="http://schemas.microsoft.com/office/drawing/2016/5/11/chartex" xmlns:cx6="http://schemas.microsoft.com/office/drawing/2016/5/12/chartex" xmlns:cx7="http://schemas.microsoft.com/office/drawing/2016/5/13/chartex" xmlns:cx8="http://schemas.microsoft.com/office/drawing/2016/5/14/chartex" xmlns:mc="http://schemas.openxmlformats.org/markup-compatibility/2006" xmlns:aink="http://schemas.microsoft.com/office/drawing/2016/ink" xmlns:am3d="http://schemas.microsoft.com/office/drawing/2017/model3d" xmlns:o="urn:schemas-microsoft-com:office:office" xmlns:oel="http://schemas.microsoft.com/office/2019/extlst" xmlns:r="http://schemas.openxmlformats.org/officeDocument/2006/relationships" xmlns:m="http://schemas.openxmlformats.org/officeDocument/2006/math" xmlns:v="urn:schemas-microsoft-com:vml" xmlns:wp14="http://schemas.microsoft.com/office/word/2010/wordprocessingDrawing" xmlns:wp="http://schemas.openxmlformats.org/drawingml/2006/wordprocessingDrawing" xmlns:w10="urn:schemas-microsoft-com:office:word" xmlns:w="http://schemas.openxmlformats.org/wordprocessingml/2006/main" xmlns:w14="http://schemas.microsoft.com/office/word/2010/wordml" xmlns:w15="http://schemas.microsoft.com/office/word/2012/wordml" xmlns:w16cex="http://schemas.microsoft.com/office/word/2018/wordml/cex" xmlns:w16cid="http://schemas.microsoft.com/office/word/2016/wordml/cid" xmlns:w16="http://schemas.microsoft.com/office/word/2018/wordml" xmlns:w16du="http://schemas.microsoft.com/office/word/2023/wordml/word16du" xmlns:w16sdtdh="http://schemas.microsoft.com/office/word/2020/wordml/sdtdatahash" xmlns:w16se="http://schemas.microsoft.com/office/word/2015/wordml/symex" xmlns:wpg="http://schemas.microsoft.com/office/word/2010/wordprocessingGroup" xmlns:wpi="http://schemas.microsoft.com/office/word/2010/wordprocessingInk" xmlns:wne="http://schemas.microsoft.com/office/word/2006/wordml" xmlns:wps="http://schemas.microsoft.com/office/word/2010/wordprocessingShape" mc:Ignorable="w14 w15 w16se w16cid w16 w16cex w16sdtdh w16du wp14">
   <w:abstractNum w:abstractNumId="0" w15:restartNumberingAfterBreak="0">
     <w:nsid w:val="6F2704F2"/>
     <w:multiLevelType w:val="multilevel"/>
@@ -6889,7 +6976,7 @@
 </file>
 
 <file path=word/styles.xml><?xml version="1.0" encoding="utf-8"?>
-<w:styles xmlns:mc="http://schemas.openxmlformats.org/markup-compatibility/2006" xmlns:r="http://schemas.openxmlformats.org/officeDocument/2006/relationships" xmlns:w="http://schemas.openxmlformats.org/wordprocessingml/2006/main" xmlns:w14="http://schemas.microsoft.com/office/word/2010/wordml" xmlns:w15="http://schemas.microsoft.com/office/word/2012/wordml" xmlns:w16cex="http://schemas.microsoft.com/office/word/2018/wordml/cex" xmlns:w16cid="http://schemas.microsoft.com/office/word/2016/wordml/cid" xmlns:w16="http://schemas.microsoft.com/office/word/2018/wordml" xmlns:w16sdtdh="http://schemas.microsoft.com/office/word/2020/wordml/sdtdatahash" xmlns:w16se="http://schemas.microsoft.com/office/word/2015/wordml/symex" mc:Ignorable="w14 w15 w16se w16cid w16 w16cex w16sdtdh">
+<w:styles xmlns:mc="http://schemas.openxmlformats.org/markup-compatibility/2006" xmlns:r="http://schemas.openxmlformats.org/officeDocument/2006/relationships" xmlns:w="http://schemas.openxmlformats.org/wordprocessingml/2006/main" xmlns:w14="http://schemas.microsoft.com/office/word/2010/wordml" xmlns:w15="http://schemas.microsoft.com/office/word/2012/wordml" xmlns:w16cex="http://schemas.microsoft.com/office/word/2018/wordml/cex" xmlns:w16cid="http://schemas.microsoft.com/office/word/2016/wordml/cid" xmlns:w16="http://schemas.microsoft.com/office/word/2018/wordml" xmlns:w16du="http://schemas.microsoft.com/office/word/2023/wordml/word16du" xmlns:w16sdtdh="http://schemas.microsoft.com/office/word/2020/wordml/sdtdatahash" xmlns:w16se="http://schemas.microsoft.com/office/word/2015/wordml/symex" mc:Ignorable="w14 w15 w16se w16cid w16 w16cex w16sdtdh w16du">
   <w:docDefaults>
     <w:rPrDefault>
       <w:rPr>
@@ -7872,21 +7959,6 @@
 </file>
 
 <file path=customXml/item1.xml><?xml version="1.0" encoding="utf-8"?>
-<p:properties xmlns:p="http://schemas.microsoft.com/office/2006/metadata/properties" xmlns:xsi="http://www.w3.org/2001/XMLSchema-instance" xmlns:pc="http://schemas.microsoft.com/office/infopath/2007/PartnerControls">
-  <documentManagement/>
-</p:properties>
-</file>
-
-<file path=customXml/item2.xml><?xml version="1.0" encoding="utf-8"?>
-<?mso-contentType ?>
-<FormTemplates xmlns="http://schemas.microsoft.com/sharepoint/v3/contenttype/forms">
-  <Display>DocumentLibraryForm</Display>
-  <Edit>DocumentLibraryForm</Edit>
-  <New>DocumentLibraryForm</New>
-</FormTemplates>
-</file>
-
-<file path=customXml/item3.xml><?xml version="1.0" encoding="utf-8"?>
 <ct:contentTypeSchema xmlns:ct="http://schemas.microsoft.com/office/2006/metadata/contentType" xmlns:ma="http://schemas.microsoft.com/office/2006/metadata/properties/metaAttributes" ct:_="" ma:_="" ma:contentTypeName="Documento" ma:contentTypeID="0x010100D81E70BDF42B174EBC609D2B5359B5D2" ma:contentTypeVersion="4" ma:contentTypeDescription="Crear nuevo documento." ma:contentTypeScope="" ma:versionID="2461c2c885fa73fe1af41445198e3330">
   <xsd:schema xmlns:xsd="http://www.w3.org/2001/XMLSchema" xmlns:xs="http://www.w3.org/2001/XMLSchema" xmlns:p="http://schemas.microsoft.com/office/2006/metadata/properties" xmlns:ns2="a857c093-8c2d-4ae3-8c85-806bcd9ec5ec" targetNamespace="http://schemas.microsoft.com/office/2006/metadata/properties" ma:root="true" ma:fieldsID="a31d02f95695f44649766d3613de645f" ns2:_="">
     <xsd:import namespace="a857c093-8c2d-4ae3-8c85-806bcd9ec5ec"/>
@@ -8030,24 +8102,22 @@
 </ct:contentTypeSchema>
 </file>
 
-<file path=customXml/itemProps1.xml><?xml version="1.0" encoding="utf-8"?>
-<ds:datastoreItem xmlns:ds="http://schemas.openxmlformats.org/officeDocument/2006/customXml" ds:itemID="{E562F910-8784-447D-AA6A-AA4FCE47202C}">
-  <ds:schemaRefs>
-    <ds:schemaRef ds:uri="http://schemas.microsoft.com/office/2006/metadata/properties"/>
-    <ds:schemaRef ds:uri="http://schemas.microsoft.com/office/infopath/2007/PartnerControls"/>
-  </ds:schemaRefs>
-</ds:datastoreItem>
+<file path=customXml/item2.xml><?xml version="1.0" encoding="utf-8"?>
+<?mso-contentType ?>
+<FormTemplates xmlns="http://schemas.microsoft.com/sharepoint/v3/contenttype/forms">
+  <Display>DocumentLibraryForm</Display>
+  <Edit>DocumentLibraryForm</Edit>
+  <New>DocumentLibraryForm</New>
+</FormTemplates>
 </file>
 
-<file path=customXml/itemProps2.xml><?xml version="1.0" encoding="utf-8"?>
-<ds:datastoreItem xmlns:ds="http://schemas.openxmlformats.org/officeDocument/2006/customXml" ds:itemID="{48DBA9B2-3C71-462F-A23B-FB910845749B}">
-  <ds:schemaRefs>
-    <ds:schemaRef ds:uri="http://schemas.microsoft.com/sharepoint/v3/contenttype/forms"/>
-  </ds:schemaRefs>
-</ds:datastoreItem>
+<file path=customXml/item3.xml><?xml version="1.0" encoding="utf-8"?>
+<p:properties xmlns:p="http://schemas.microsoft.com/office/2006/metadata/properties" xmlns:xsi="http://www.w3.org/2001/XMLSchema-instance" xmlns:pc="http://schemas.microsoft.com/office/infopath/2007/PartnerControls">
+  <documentManagement/>
+</p:properties>
 </file>
 
-<file path=customXml/itemProps3.xml><?xml version="1.0" encoding="utf-8"?>
+<file path=customXml/itemProps1.xml><?xml version="1.0" encoding="utf-8"?>
 <ds:datastoreItem xmlns:ds="http://schemas.openxmlformats.org/officeDocument/2006/customXml" ds:itemID="{2D6EED8D-1678-4294-BE5D-4C396F81410E}">
   <ds:schemaRefs>
     <ds:schemaRef ds:uri="http://schemas.microsoft.com/office/2006/metadata/contentType"/>
@@ -8063,4 +8133,21 @@
     <ds:schemaRef ds:uri="http://schemas.microsoft.com/internal/obd"/>
   </ds:schemaRefs>
 </ds:datastoreItem>
+</file>
+
+<file path=customXml/itemProps2.xml><?xml version="1.0" encoding="utf-8"?>
+<ds:datastoreItem xmlns:ds="http://schemas.openxmlformats.org/officeDocument/2006/customXml" ds:itemID="{48DBA9B2-3C71-462F-A23B-FB910845749B}">
+  <ds:schemaRefs>
+    <ds:schemaRef ds:uri="http://schemas.microsoft.com/sharepoint/v3/contenttype/forms"/>
+  </ds:schemaRefs>
+</ds:datastoreItem>
+</file>
+
+<file path=customXml/itemProps3.xml><?xml version="1.0" encoding="utf-8"?>
+<ds:datastoreItem xmlns:ds="http://schemas.openxmlformats.org/officeDocument/2006/customXml" ds:itemID="{E562F910-8784-447D-AA6A-AA4FCE47202C}">
+  <ds:schemaRefs>
+    <ds:schemaRef ds:uri="http://schemas.microsoft.com/office/2006/metadata/properties"/>
+    <ds:schemaRef ds:uri="http://schemas.microsoft.com/office/infopath/2007/PartnerControls"/>
+  </ds:schemaRefs>
+</ds:datastoreItem>
 </file>
</xml_diff>